<commit_message>
Clarify companies contacted metric
</commit_message>
<xml_diff>
--- a/docs/Implementation_Plan.docx
+++ b/docs/Implementation_Plan.docx
@@ -1989,20 +1989,14 @@
           </w:tcPr>
           <w:p>
             <w:r>
-              <w:t xml:space="preserve">Unique </w:t>
+              <w:t>Companies contacted by country</w:t>
             </w:r>
             <w:proofErr w:type="spellStart"/>
-            <w:r>
-              <w:t>companies</w:t>
-            </w:r>
+            <w:r/>
             <w:proofErr w:type="spellEnd"/>
-            <w:r>
-              <w:t xml:space="preserve"> </w:t>
-            </w:r>
+            <w:r/>
             <w:proofErr w:type="spellStart"/>
-            <w:r>
-              <w:t>contacted</w:t>
-            </w:r>
+            <w:r/>
             <w:proofErr w:type="spellEnd"/>
           </w:p>
         </w:tc>
@@ -2014,12 +2008,10 @@
           </w:tcPr>
           <w:p>
             <w:r>
-              <w:t xml:space="preserve">Number </w:t>
+              <w:t>Country and company count</w:t>
             </w:r>
             <w:proofErr w:type="spellStart"/>
-            <w:r>
-              <w:t>counter</w:t>
-            </w:r>
+            <w:r/>
             <w:proofErr w:type="spellEnd"/>
           </w:p>
         </w:tc>
@@ -2036,12 +2028,10 @@
           </w:tcPr>
           <w:p>
             <w:r>
-              <w:t xml:space="preserve">Countries </w:t>
+              <w:t>Companies contacted</w:t>
             </w:r>
             <w:proofErr w:type="spellStart"/>
-            <w:r>
-              <w:t>contacted</w:t>
-            </w:r>
+            <w:r/>
             <w:proofErr w:type="spellEnd"/>
           </w:p>
         </w:tc>
@@ -2053,20 +2043,14 @@
           </w:tcPr>
           <w:p>
             <w:r>
-              <w:t xml:space="preserve">Country and </w:t>
+              <w:t>Automatically calculated as sum of country company counts</w:t>
             </w:r>
             <w:proofErr w:type="spellStart"/>
-            <w:r>
-              <w:t>company</w:t>
-            </w:r>
+            <w:r/>
             <w:proofErr w:type="spellEnd"/>
-            <w:r>
-              <w:t xml:space="preserve"> </w:t>
-            </w:r>
+            <w:r/>
             <w:proofErr w:type="spellStart"/>
-            <w:r>
-              <w:t>count</w:t>
-            </w:r>
+            <w:r/>
             <w:proofErr w:type="spellEnd"/>
           </w:p>
         </w:tc>
@@ -2631,7 +2615,7 @@
         <w:rPr>
           <w:lang w:val="en-US"/>
         </w:rPr>
-        <w:t>If the country totals do not match the unique company total, show a warning but allow the record to be saved.</w:t>
+        <w:t>Users enter the number of companies contacted for each selected country. Companies contacted is calculated automatically as the sum of those country company counts. Users do not enter the aggregate value separately. Because the application does not collect company names or identifiers for outreach, it does not verify uniqueness or perform deduplication. The internal unique_companies field may be retained for backward compatibility; its user-facing meaning is the automatically calculated Companies contacted metric.</w:t>
       </w:r>
     </w:p>
     <w:p>
@@ -2894,20 +2878,14 @@
         </w:numPr>
       </w:pPr>
       <w:r>
-        <w:t xml:space="preserve">Unique </w:t>
-      </w:r>
-      <w:proofErr w:type="spellStart"/>
-      <w:r>
-        <w:t>companies</w:t>
-      </w:r>
-      <w:proofErr w:type="spellEnd"/>
-      <w:r>
-        <w:t xml:space="preserve"> </w:t>
-      </w:r>
-      <w:proofErr w:type="spellStart"/>
-      <w:r>
-        <w:t>contacted</w:t>
-      </w:r>
+        <w:t>Companies contacted</w:t>
+      </w:r>
+      <w:proofErr w:type="spellStart"/>
+      <w:r/>
+      <w:proofErr w:type="spellEnd"/>
+      <w:r/>
+      <w:proofErr w:type="spellStart"/>
+      <w:r/>
       <w:proofErr w:type="spellEnd"/>
     </w:p>
     <w:p>
@@ -3675,40 +3653,24 @@
     <w:p>
       <w:proofErr w:type="spellStart"/>
       <w:r>
-        <w:t>meetings</w:t>
-      </w:r>
-      <w:proofErr w:type="spellEnd"/>
-      <w:r>
-        <w:t xml:space="preserve"> </w:t>
-      </w:r>
-      <w:proofErr w:type="spellStart"/>
-      <w:r>
-        <w:t>booked</w:t>
-      </w:r>
-      <w:proofErr w:type="spellEnd"/>
-      <w:r>
-        <w:t xml:space="preserve"> / </w:t>
-      </w:r>
-      <w:proofErr w:type="spellStart"/>
-      <w:r>
-        <w:t>unique</w:t>
-      </w:r>
-      <w:proofErr w:type="spellEnd"/>
-      <w:r>
-        <w:t xml:space="preserve"> </w:t>
-      </w:r>
-      <w:proofErr w:type="spellStart"/>
-      <w:r>
-        <w:t>companies</w:t>
-      </w:r>
-      <w:proofErr w:type="spellEnd"/>
-      <w:r>
-        <w:t xml:space="preserve"> </w:t>
-      </w:r>
-      <w:proofErr w:type="spellStart"/>
-      <w:r>
-        <w:t>contacted</w:t>
-      </w:r>
+        <w:t>meetings booked / companies contacted</w:t>
+      </w:r>
+      <w:proofErr w:type="spellEnd"/>
+      <w:r/>
+      <w:proofErr w:type="spellStart"/>
+      <w:r/>
+      <w:proofErr w:type="spellEnd"/>
+      <w:r/>
+      <w:proofErr w:type="spellStart"/>
+      <w:r/>
+      <w:proofErr w:type="spellEnd"/>
+      <w:r/>
+      <w:proofErr w:type="spellStart"/>
+      <w:r/>
+      <w:proofErr w:type="spellEnd"/>
+      <w:r/>
+      <w:proofErr w:type="spellStart"/>
+      <w:r/>
       <w:proofErr w:type="spellEnd"/>
     </w:p>
     <w:p>

</xml_diff>